<commit_message>
docs: define first narrative vertical slice
</commit_message>
<xml_diff>
--- a/docs/El_Teorema_del_Si_GDD.docx
+++ b/docs/El_Teorema_del_Si_GDD.docx
@@ -3140,7 +3140,34 @@
           <w:color w:val="263238"/>
           <w:sz w:val="21"/>
         </w:rPr>
-        <w:t>En la mañana de una celebración importante, el protagonista llega a la Plaza del Axioma y descubre que la novia ha desaparecido. No existen señales de violencia ni petición de rescate. En su lugar encuentra un mapa incompleto, una nota escrita mediante símbolos y una pieza perteneciente a un mecanismo desconocido.</w:t>
+        <w:t>El día anterior a la boda, el protagonista se encuentra en la Plaza del Axioma mientras los habitantes preparan la ceremonia. Entre mesas, sillas, flores y cajas todavía por colocar, el padre de la novia le comunica que ella no está en su habitación y que nadie sabe dónde se encuentra. No existen señales de violencia ni petición de rescate.</w:t>
+      </w:r>
+    </w:p>
+    <w:p>
+      <w:r>
+        <w:rPr>
+          <w:rFonts w:ascii="Liberation Sans" w:hAnsi="Liberation Sans"/>
+          <w:color w:val="263238"/>
+          <w:sz w:val="21"/>
+        </w:rPr>
+        <w:t xml:space="preserve">El padre entrega al protagonista una nota encontrada en la habitación de la novia. El mensaje indica que estaba investigando algo antes de la ceremonia y conduce al </w:t>
+      </w:r>
+      <w:r>
+        <w:rPr>
+          <w:rFonts w:ascii="Liberation Sans" w:hAnsi="Liberation Sans"/>
+          <w:b/>
+          <w:color w:val="263238"/>
+          <w:sz w:val="21"/>
+        </w:rPr>
+        <w:t>Paseo de los Siete Puentes</w:t>
+      </w:r>
+      <w:r>
+        <w:rPr>
+          <w:rFonts w:ascii="Liberation Sans" w:hAnsi="Liberation Sans"/>
+          <w:color w:val="263238"/>
+          <w:sz w:val="21"/>
+        </w:rPr>
+        <w:t>. Allí, el protagonista encuentra un mapa alterado y la primera evidencia que relaciona su desaparición con la biblioteca.</w:t>
       </w:r>
     </w:p>
     <w:p>
@@ -3605,7 +3632,7 @@
           <w:color w:val="1F5964"/>
           <w:sz w:val="23"/>
         </w:rPr>
-        <w:t>Prólogo: la ceremonia vacía</w:t>
+        <w:t>Prólogo: la víspera interrumpida</w:t>
       </w:r>
     </w:p>
     <w:p>
@@ -3615,7 +3642,7 @@
           <w:color w:val="263238"/>
           <w:sz w:val="21"/>
         </w:rPr>
-        <w:t>Se presentan la plaza, los controles y la ausencia de la novia. La primera nota conduce a la biblioteca.</w:t>
+        <w:t>Se presentan la Plaza del Axioma, los preparativos de la boda y los controles básicos. El padre de la novia entrega una nota encontrada en su habitación, que conduce al Paseo de los Siete Puentes. La resolución del primer problema revela una pista relacionada con la biblioteca.</w:t>
       </w:r>
     </w:p>
     <w:p>
@@ -4605,7 +4632,7 @@
         </w:trPr>
         <w:tc>
           <w:tcPr>
-            <w:tcW w:type="dxa" w:w="3725"/>
+            <w:tcW w:type="dxa" w:w="3533"/>
             <w:shd w:fill="1F5964"/>
             <w:tcMar>
               <w:top w:w="100" w:type="dxa"/>
@@ -4632,7 +4659,7 @@
         </w:tc>
         <w:tc>
           <w:tcPr>
-            <w:tcW w:type="dxa" w:w="3299"/>
+            <w:tcW w:type="dxa" w:w="3634"/>
             <w:shd w:fill="1F5964"/>
             <w:tcMar>
               <w:top w:w="100" w:type="dxa"/>
@@ -4659,7 +4686,7 @@
         </w:tc>
         <w:tc>
           <w:tcPr>
-            <w:tcW w:type="dxa" w:w="2767"/>
+            <w:tcW w:type="dxa" w:w="2625"/>
             <w:shd w:fill="1F5964"/>
             <w:tcMar>
               <w:top w:w="100" w:type="dxa"/>
@@ -4691,7 +4718,7 @@
         </w:trPr>
         <w:tc>
           <w:tcPr>
-            <w:tcW w:type="dxa" w:w="3725"/>
+            <w:tcW w:type="dxa" w:w="3533"/>
             <w:tcMar>
               <w:top w:w="95" w:type="dxa"/>
               <w:start w:w="100" w:type="dxa"/>
@@ -4716,7 +4743,7 @@
         </w:tc>
         <w:tc>
           <w:tcPr>
-            <w:tcW w:type="dxa" w:w="3299"/>
+            <w:tcW w:type="dxa" w:w="3634"/>
             <w:tcMar>
               <w:top w:w="95" w:type="dxa"/>
               <w:start w:w="100" w:type="dxa"/>
@@ -4741,7 +4768,7 @@
         </w:tc>
         <w:tc>
           <w:tcPr>
-            <w:tcW w:type="dxa" w:w="2767"/>
+            <w:tcW w:type="dxa" w:w="2625"/>
             <w:tcMar>
               <w:top w:w="95" w:type="dxa"/>
               <w:start w:w="100" w:type="dxa"/>
@@ -4771,7 +4798,7 @@
         </w:trPr>
         <w:tc>
           <w:tcPr>
-            <w:tcW w:type="dxa" w:w="3725"/>
+            <w:tcW w:type="dxa" w:w="3533"/>
             <w:tcMar>
               <w:top w:w="95" w:type="dxa"/>
               <w:start w:w="100" w:type="dxa"/>
@@ -4796,7 +4823,7 @@
         </w:tc>
         <w:tc>
           <w:tcPr>
-            <w:tcW w:type="dxa" w:w="3299"/>
+            <w:tcW w:type="dxa" w:w="3634"/>
             <w:tcMar>
               <w:top w:w="95" w:type="dxa"/>
               <w:start w:w="100" w:type="dxa"/>
@@ -4821,7 +4848,7 @@
         </w:tc>
         <w:tc>
           <w:tcPr>
-            <w:tcW w:type="dxa" w:w="2767"/>
+            <w:tcW w:type="dxa" w:w="2625"/>
             <w:tcMar>
               <w:top w:w="95" w:type="dxa"/>
               <w:start w:w="100" w:type="dxa"/>
@@ -4851,7 +4878,7 @@
         </w:trPr>
         <w:tc>
           <w:tcPr>
-            <w:tcW w:type="dxa" w:w="3725"/>
+            <w:tcW w:type="dxa" w:w="3533"/>
             <w:tcMar>
               <w:top w:w="95" w:type="dxa"/>
               <w:start w:w="100" w:type="dxa"/>
@@ -4870,13 +4897,13 @@
                 <w:color w:val="263238"/>
                 <w:sz w:val="17"/>
               </w:rPr>
-              <w:t>Barrio de los Puentes</w:t>
+              <w:t>Paseo de los Siete Puentes</w:t>
             </w:r>
           </w:p>
         </w:tc>
         <w:tc>
           <w:tcPr>
-            <w:tcW w:type="dxa" w:w="3299"/>
+            <w:tcW w:type="dxa" w:w="3634"/>
             <w:tcMar>
               <w:top w:w="95" w:type="dxa"/>
               <w:start w:w="100" w:type="dxa"/>
@@ -4895,13 +4922,13 @@
                 <w:color w:val="263238"/>
                 <w:sz w:val="17"/>
               </w:rPr>
-              <w:t>Navegación y testimonios</w:t>
+              <w:t>Primera investigación y conectividad</w:t>
             </w:r>
           </w:p>
         </w:tc>
         <w:tc>
           <w:tcPr>
-            <w:tcW w:type="dxa" w:w="2767"/>
+            <w:tcW w:type="dxa" w:w="2625"/>
             <w:tcMar>
               <w:top w:w="95" w:type="dxa"/>
               <w:start w:w="100" w:type="dxa"/>
@@ -4931,7 +4958,7 @@
         </w:trPr>
         <w:tc>
           <w:tcPr>
-            <w:tcW w:type="dxa" w:w="3725"/>
+            <w:tcW w:type="dxa" w:w="3533"/>
             <w:tcMar>
               <w:top w:w="95" w:type="dxa"/>
               <w:start w:w="100" w:type="dxa"/>
@@ -4956,7 +4983,7 @@
         </w:tc>
         <w:tc>
           <w:tcPr>
-            <w:tcW w:type="dxa" w:w="3299"/>
+            <w:tcW w:type="dxa" w:w="3634"/>
             <w:tcMar>
               <w:top w:w="95" w:type="dxa"/>
               <w:start w:w="100" w:type="dxa"/>
@@ -4981,7 +5008,7 @@
         </w:tc>
         <w:tc>
           <w:tcPr>
-            <w:tcW w:type="dxa" w:w="2767"/>
+            <w:tcW w:type="dxa" w:w="2625"/>
             <w:tcMar>
               <w:top w:w="95" w:type="dxa"/>
               <w:start w:w="100" w:type="dxa"/>
@@ -5011,7 +5038,7 @@
         </w:trPr>
         <w:tc>
           <w:tcPr>
-            <w:tcW w:type="dxa" w:w="3725"/>
+            <w:tcW w:type="dxa" w:w="3533"/>
             <w:tcMar>
               <w:top w:w="95" w:type="dxa"/>
               <w:start w:w="100" w:type="dxa"/>
@@ -5036,7 +5063,7 @@
         </w:tc>
         <w:tc>
           <w:tcPr>
-            <w:tcW w:type="dxa" w:w="3299"/>
+            <w:tcW w:type="dxa" w:w="3634"/>
             <w:tcMar>
               <w:top w:w="95" w:type="dxa"/>
               <w:start w:w="100" w:type="dxa"/>
@@ -5061,7 +5088,7 @@
         </w:tc>
         <w:tc>
           <w:tcPr>
-            <w:tcW w:type="dxa" w:w="2767"/>
+            <w:tcW w:type="dxa" w:w="2625"/>
             <w:tcMar>
               <w:top w:w="95" w:type="dxa"/>
               <w:start w:w="100" w:type="dxa"/>
@@ -5091,7 +5118,7 @@
         </w:trPr>
         <w:tc>
           <w:tcPr>
-            <w:tcW w:type="dxa" w:w="3725"/>
+            <w:tcW w:type="dxa" w:w="3533"/>
             <w:tcMar>
               <w:top w:w="95" w:type="dxa"/>
               <w:start w:w="100" w:type="dxa"/>
@@ -5116,7 +5143,7 @@
         </w:tc>
         <w:tc>
           <w:tcPr>
-            <w:tcW w:type="dxa" w:w="3299"/>
+            <w:tcW w:type="dxa" w:w="3634"/>
             <w:tcMar>
               <w:top w:w="95" w:type="dxa"/>
               <w:start w:w="100" w:type="dxa"/>
@@ -5141,7 +5168,7 @@
         </w:tc>
         <w:tc>
           <w:tcPr>
-            <w:tcW w:type="dxa" w:w="2767"/>
+            <w:tcW w:type="dxa" w:w="2625"/>
             <w:tcMar>
               <w:top w:w="95" w:type="dxa"/>
               <w:start w:w="100" w:type="dxa"/>
@@ -5171,7 +5198,7 @@
         </w:trPr>
         <w:tc>
           <w:tcPr>
-            <w:tcW w:type="dxa" w:w="3725"/>
+            <w:tcW w:type="dxa" w:w="3533"/>
             <w:tcMar>
               <w:top w:w="95" w:type="dxa"/>
               <w:start w:w="100" w:type="dxa"/>
@@ -5196,7 +5223,7 @@
         </w:tc>
         <w:tc>
           <w:tcPr>
-            <w:tcW w:type="dxa" w:w="3299"/>
+            <w:tcW w:type="dxa" w:w="3634"/>
             <w:tcMar>
               <w:top w:w="95" w:type="dxa"/>
               <w:start w:w="100" w:type="dxa"/>
@@ -5221,7 +5248,7 @@
         </w:tc>
         <w:tc>
           <w:tcPr>
-            <w:tcW w:type="dxa" w:w="2767"/>
+            <w:tcW w:type="dxa" w:w="2625"/>
             <w:tcMar>
               <w:top w:w="95" w:type="dxa"/>
               <w:start w:w="100" w:type="dxa"/>
@@ -5272,7 +5299,7 @@
           <w:color w:val="263238"/>
           <w:sz w:val="21"/>
         </w:rPr>
-        <w:t>Después del prólogo se abren dos líneas de investigación: Puentes y Jardín. Al avanzar en ambas se desbloquean Observatorio y Molino, también resolubles en cualquier orden. El Archivo utiliza una progresión más lineal para concentrar la tensión.</w:t>
+        <w:t>El prólogo conecta la Plaza del Axioma con el Paseo de los Siete Puentes. Resolver P2 revela una pista que abre la Biblioteca del Margen como siguiente destino. A partir de la investigación en la biblioteca se habilita parcialmente el Jardín; más adelante se desbloquean Observatorio y Molino, resolubles en un orden flexible. El Archivo utiliza una progresión más lineal para concentrar la tensión.</w:t>
       </w:r>
     </w:p>
     <w:p>
@@ -5306,7 +5333,7 @@
           <w:color w:val="263238"/>
           <w:sz w:val="21"/>
         </w:rPr>
-        <w:t>La plaza es el punto inicial y final. Contiene la ceremonia, la fuente central, el ayuntamiento, el tablón y los accesos a las zonas. Evoluciona durante la partida:</w:t>
+        <w:t>La plaza es el punto inicial y final. Contiene el altar, la fuente central, el ayuntamiento, el tablón y los accesos a las zonas. Evoluciona durante la partida:</w:t>
       </w:r>
     </w:p>
     <w:p>
@@ -5321,7 +5348,22 @@
           <w:color w:val="263238"/>
           <w:sz w:val="20"/>
         </w:rPr>
-        <w:t>Al inicio está preparada y llena de invitados confundidos.</w:t>
+        <w:t>Al inicio está en plena preparación para la boda del día siguiente, con mesas, sillas, flores, cajas y habitantes trabajando.</w:t>
+      </w:r>
+    </w:p>
+    <w:p>
+      <w:pPr>
+        <w:pStyle w:val="ListBullet"/>
+        <w:spacing w:after="40"/>
+        <w:ind w:left="288" w:hanging="230"/>
+      </w:pPr>
+      <w:r>
+        <w:rPr>
+          <w:rFonts w:ascii="Liberation Sans" w:hAnsi="Liberation Sans"/>
+          <w:color w:val="263238"/>
+          <w:sz w:val="20"/>
+        </w:rPr>
+        <w:t>Durante el prólogo, el padre de la novia entrega la nota que inicia la búsqueda.</w:t>
       </w:r>
     </w:p>
     <w:p>
@@ -5409,7 +5451,7 @@
           <w:color w:val="9A6138"/>
           <w:sz w:val="28"/>
         </w:rPr>
-        <w:t>3.6. Barrio de los Puentes</w:t>
+        <w:t>3.6. Paseo de los Siete Puentes</w:t>
       </w:r>
     </w:p>
     <w:p>
@@ -5419,7 +5461,7 @@
           <w:color w:val="263238"/>
           <w:sz w:val="21"/>
         </w:rPr>
-        <w:t>Un río dividido en canales, islotes y pasarelas. Maestro Nodo intenta recorrer todos los puentes bajo reglas imposibles. El jugador manipula compuertas, observa rutas de NPCs y reconstruye el recorrido de la novia.</w:t>
+        <w:t>Un río dividido en canales, islotes y pasarelas. Durante el prólogo, el protagonista sigue la nota de la novia hasta un mapa manipulado que plantea P2, «El paseo imposible».</w:t>
       </w:r>
     </w:p>
     <w:p>
@@ -5429,7 +5471,7 @@
           <w:color w:val="263238"/>
           <w:sz w:val="21"/>
         </w:rPr>
-        <w:t>Resolver la zona redirige el agua, abre el acceso al molino y crea un atajo hacia el jardín.</w:t>
+        <w:t>Resolver el primer problema revela una anotación de la novia y un símbolo relacionado con la biblioteca. Las compuertas, el acceso al molino y el atajo hacia el jardín se desarrollarán posteriormente cuando el jugador regrese a la zona.</w:t>
       </w:r>
     </w:p>
     <w:p>
@@ -5652,7 +5694,7 @@
           <w:color w:val="263238"/>
           <w:sz w:val="20"/>
         </w:rPr>
-        <w:t>Mañana luminosa durante el prólogo.</w:t>
+        <w:t>Mañana luminosa durante la víspera y el prólogo.</w:t>
       </w:r>
     </w:p>
     <w:p>
@@ -6754,7 +6796,7 @@
           <w:color w:val="263238"/>
           <w:sz w:val="20"/>
         </w:rPr>
-        <w:t xml:space="preserve"> coordinar ceremonia, investigación y cambios del mundo.</w:t>
+        <w:t xml:space="preserve"> coordinar los preparativos de la ceremonia, introducir los controles básicos y comunicar los cambios del mundo.</w:t>
       </w:r>
     </w:p>
     <w:p>
@@ -6802,7 +6844,7 @@
           <w:color w:val="263238"/>
           <w:sz w:val="20"/>
         </w:rPr>
-        <w:t xml:space="preserve"> intenta controlar un pueblo construido sobre sistemas desconocidos.</w:t>
+        <w:t xml:space="preserve"> intenta controlar tanto una boda como un pueblo construido sobre sistemas desconocidos.</w:t>
       </w:r>
     </w:p>
     <w:p>
@@ -6826,7 +6868,7 @@
           <w:color w:val="263238"/>
           <w:sz w:val="20"/>
         </w:rPr>
-        <w:t xml:space="preserve"> deja de ocultar el incidente y apoya la investigación.</w:t>
+        <w:t xml:space="preserve"> comienza tratando cualquier imprevisto como un retraso logístico y termina apoyando abiertamente la investigación.</w:t>
       </w:r>
     </w:p>
     <w:p>
@@ -6850,7 +6892,31 @@
           <w:color w:val="263238"/>
           <w:sz w:val="20"/>
         </w:rPr>
-        <w:t xml:space="preserve"> banda municipal, carpeta y reloj.</w:t>
+        <w:t xml:space="preserve"> banda municipal, carpeta, reloj y lista de preparativos.</w:t>
+      </w:r>
+    </w:p>
+    <w:p>
+      <w:pPr>
+        <w:pStyle w:val="ListBullet"/>
+        <w:spacing w:after="40"/>
+        <w:ind w:left="288" w:hanging="230"/>
+      </w:pPr>
+      <w:r>
+        <w:rPr>
+          <w:rFonts w:ascii="Liberation Sans" w:hAnsi="Liberation Sans"/>
+          <w:b/>
+          <w:color w:val="263238"/>
+          <w:sz w:val="20"/>
+        </w:rPr>
+        <w:t>Papel en el prólogo:</w:t>
+      </w:r>
+      <w:r>
+        <w:rPr>
+          <w:rFonts w:ascii="Liberation Sans" w:hAnsi="Liberation Sans"/>
+          <w:color w:val="263238"/>
+          <w:sz w:val="20"/>
+        </w:rPr>
+        <w:t xml:space="preserve"> recibe al protagonista, le pide que revise la plaza y dirige su atención hacia el tablón de preparativos. Actúa como tutorial diegético sin conocer todavía la desaparición.</w:t>
       </w:r>
     </w:p>
     <w:p>
@@ -6864,7 +6930,175 @@
           <w:color w:val="9A6138"/>
           <w:sz w:val="28"/>
         </w:rPr>
-        <w:t>4.11. Testigo Cero</w:t>
+        <w:t>4.11. Padre de la Investigadora</w:t>
+      </w:r>
+    </w:p>
+    <w:p>
+      <w:pPr>
+        <w:pStyle w:val="ListBullet"/>
+        <w:spacing w:after="40"/>
+        <w:ind w:left="288" w:hanging="230"/>
+      </w:pPr>
+      <w:r>
+        <w:rPr>
+          <w:rFonts w:ascii="Liberation Sans" w:hAnsi="Liberation Sans"/>
+          <w:b/>
+          <w:color w:val="263238"/>
+          <w:sz w:val="20"/>
+        </w:rPr>
+        <w:t>Zona inicial:</w:t>
+      </w:r>
+      <w:r>
+        <w:rPr>
+          <w:rFonts w:ascii="Liberation Sans" w:hAnsi="Liberation Sans"/>
+          <w:color w:val="263238"/>
+          <w:sz w:val="20"/>
+        </w:rPr>
+        <w:t xml:space="preserve"> Plaza del Axioma.</w:t>
+      </w:r>
+    </w:p>
+    <w:p>
+      <w:pPr>
+        <w:pStyle w:val="ListBullet"/>
+        <w:spacing w:after="40"/>
+        <w:ind w:left="288" w:hanging="230"/>
+      </w:pPr>
+      <w:r>
+        <w:rPr>
+          <w:rFonts w:ascii="Liberation Sans" w:hAnsi="Liberation Sans"/>
+          <w:b/>
+          <w:color w:val="263238"/>
+          <w:sz w:val="20"/>
+        </w:rPr>
+        <w:t>Función:</w:t>
+      </w:r>
+      <w:r>
+        <w:rPr>
+          <w:rFonts w:ascii="Liberation Sans" w:hAnsi="Liberation Sans"/>
+          <w:color w:val="263238"/>
+          <w:sz w:val="20"/>
+        </w:rPr>
+        <w:t xml:space="preserve"> iniciar la búsqueda y entregar la primera nota de la novia.</w:t>
+      </w:r>
+    </w:p>
+    <w:p>
+      <w:pPr>
+        <w:pStyle w:val="ListBullet"/>
+        <w:spacing w:after="40"/>
+        <w:ind w:left="288" w:hanging="230"/>
+      </w:pPr>
+      <w:r>
+        <w:rPr>
+          <w:rFonts w:ascii="Liberation Sans" w:hAnsi="Liberation Sans"/>
+          <w:b/>
+          <w:color w:val="263238"/>
+          <w:sz w:val="20"/>
+        </w:rPr>
+        <w:t>Personalidad:</w:t>
+      </w:r>
+      <w:r>
+        <w:rPr>
+          <w:rFonts w:ascii="Liberation Sans" w:hAnsi="Liberation Sans"/>
+          <w:color w:val="263238"/>
+          <w:sz w:val="20"/>
+        </w:rPr>
+        <w:t xml:space="preserve"> afectuoso, prudente y visiblemente preocupado, aunque intenta mantener la calma para no alarmar a todo el pueblo.</w:t>
+      </w:r>
+    </w:p>
+    <w:p>
+      <w:pPr>
+        <w:pStyle w:val="ListBullet"/>
+        <w:spacing w:after="40"/>
+        <w:ind w:left="288" w:hanging="230"/>
+      </w:pPr>
+      <w:r>
+        <w:rPr>
+          <w:rFonts w:ascii="Liberation Sans" w:hAnsi="Liberation Sans"/>
+          <w:b/>
+          <w:color w:val="263238"/>
+          <w:sz w:val="20"/>
+        </w:rPr>
+        <w:t>Contradicción:</w:t>
+      </w:r>
+      <w:r>
+        <w:rPr>
+          <w:rFonts w:ascii="Liberation Sans" w:hAnsi="Liberation Sans"/>
+          <w:color w:val="263238"/>
+          <w:sz w:val="20"/>
+        </w:rPr>
+        <w:t xml:space="preserve"> quiere proteger a su hija, pero comprende que ocultar la nota impediría encontrarla.</w:t>
+      </w:r>
+    </w:p>
+    <w:p>
+      <w:pPr>
+        <w:pStyle w:val="ListBullet"/>
+        <w:spacing w:after="40"/>
+        <w:ind w:left="288" w:hanging="230"/>
+      </w:pPr>
+      <w:r>
+        <w:rPr>
+          <w:rFonts w:ascii="Liberation Sans" w:hAnsi="Liberation Sans"/>
+          <w:b/>
+          <w:color w:val="263238"/>
+          <w:sz w:val="20"/>
+        </w:rPr>
+        <w:t>Evolución:</w:t>
+      </w:r>
+      <w:r>
+        <w:rPr>
+          <w:rFonts w:ascii="Liberation Sans" w:hAnsi="Liberation Sans"/>
+          <w:color w:val="263238"/>
+          <w:sz w:val="20"/>
+        </w:rPr>
+        <w:t xml:space="preserve"> pasa de pedir una búsqueda discreta a colaborar activamente cuando aparecen pruebas del Archivo.</w:t>
+      </w:r>
+    </w:p>
+    <w:p>
+      <w:pPr>
+        <w:pStyle w:val="ListBullet"/>
+        <w:spacing w:after="40"/>
+        <w:ind w:left="288" w:hanging="230"/>
+      </w:pPr>
+      <w:r>
+        <w:rPr>
+          <w:rFonts w:ascii="Liberation Sans" w:hAnsi="Liberation Sans"/>
+          <w:b/>
+          <w:color w:val="263238"/>
+          <w:sz w:val="20"/>
+        </w:rPr>
+        <w:t>Rasgo visual:</w:t>
+      </w:r>
+      <w:r>
+        <w:rPr>
+          <w:rFonts w:ascii="Liberation Sans" w:hAnsi="Liberation Sans"/>
+          <w:color w:val="263238"/>
+          <w:sz w:val="20"/>
+        </w:rPr>
+        <w:t xml:space="preserve"> ropa preparada para ayudar con la ceremonia y la nota doblada en la mano.</w:t>
+      </w:r>
+    </w:p>
+    <w:p>
+      <w:pPr>
+        <w:pStyle w:val="ListBullet"/>
+        <w:spacing w:after="40"/>
+        <w:ind w:left="288" w:hanging="230"/>
+      </w:pPr>
+      <w:r>
+        <w:rPr>
+          <w:rFonts w:ascii="Liberation Sans" w:hAnsi="Liberation Sans"/>
+          <w:b/>
+          <w:color w:val="263238"/>
+          <w:sz w:val="20"/>
+        </w:rPr>
+        <w:t>Papel en el prólogo:</w:t>
+      </w:r>
+      <w:r>
+        <w:rPr>
+          <w:rFonts w:ascii="Liberation Sans" w:hAnsi="Liberation Sans"/>
+          <w:color w:val="263238"/>
+          <w:sz w:val="20"/>
+        </w:rPr>
+        <w:t xml:space="preserve"> explica que la novia no está en su habitación, entrega la nota al protagonista y activa el objetivo de investigar el Paseo de los Siete Puentes.</w:t>
       </w:r>
     </w:p>
     <w:p>
@@ -6874,17 +7108,7 @@
           <w:color w:val="263238"/>
           <w:sz w:val="21"/>
         </w:rPr>
-        <w:t>Personaje recurrente aparentemente inútil. Sus declaraciones parecen contradictorias porque utiliza referencias temporales y espaciales ambiguas, pero son verificables. La novia fue una de las pocas personas que aprendió a interpretarlo.</w:t>
-      </w:r>
-    </w:p>
-    <w:p>
-      <w:r>
-        <w:rPr>
-          <w:rFonts w:ascii="Liberation Sans" w:hAnsi="Liberation Sans"/>
-          <w:color w:val="263238"/>
-          <w:sz w:val="21"/>
-        </w:rPr>
-        <w:t>Debe utilizarse con cuidado: sus frases nunca servirán como excusa para una pista arbitraria.</w:t>
+        <w:t>El personaje se mantendrá sin nombre definitivo hasta disponer de referencias personales para su versión final.</w:t>
       </w:r>
     </w:p>
     <w:p>
@@ -6898,82 +7122,27 @@
           <w:color w:val="9A6138"/>
           <w:sz w:val="28"/>
         </w:rPr>
-        <w:t>4.12. Relaciones</w:t>
-      </w:r>
-    </w:p>
-    <w:p>
-      <w:pPr>
-        <w:pStyle w:val="ListBullet"/>
-        <w:spacing w:after="40"/>
-        <w:ind w:left="288" w:hanging="230"/>
-      </w:pPr>
-      <w:r>
-        <w:rPr>
-          <w:rFonts w:ascii="Liberation Sans" w:hAnsi="Liberation Sans"/>
-          <w:color w:val="263238"/>
-          <w:sz w:val="20"/>
-        </w:rPr>
-        <w:t>Nodo y Prima discuten sobre si todo debe estar conectado.</w:t>
-      </w:r>
-    </w:p>
-    <w:p>
-      <w:pPr>
-        <w:pStyle w:val="ListBullet"/>
-        <w:spacing w:after="40"/>
-        <w:ind w:left="288" w:hanging="230"/>
-      </w:pPr>
-      <w:r>
-        <w:rPr>
-          <w:rFonts w:ascii="Liberation Sans" w:hAnsi="Liberation Sans"/>
-          <w:color w:val="263238"/>
-          <w:sz w:val="20"/>
-        </w:rPr>
-        <w:t>Silogio documenta inventos cuyos nombres Permuto cambia constantemente.</w:t>
-      </w:r>
-    </w:p>
-    <w:p>
-      <w:pPr>
-        <w:pStyle w:val="ListBullet"/>
-        <w:spacing w:after="40"/>
-        <w:ind w:left="288" w:hanging="230"/>
-      </w:pPr>
-      <w:r>
-        <w:rPr>
-          <w:rFonts w:ascii="Liberation Sans" w:hAnsi="Liberation Sans"/>
-          <w:color w:val="263238"/>
-          <w:sz w:val="20"/>
-        </w:rPr>
-        <w:t>Corolaria exige predicciones exactas a Paralaje.</w:t>
-      </w:r>
-    </w:p>
-    <w:p>
-      <w:pPr>
-        <w:pStyle w:val="ListBullet"/>
-        <w:spacing w:after="40"/>
-        <w:ind w:left="288" w:hanging="230"/>
-      </w:pPr>
-      <w:r>
-        <w:rPr>
-          <w:rFonts w:ascii="Liberation Sans" w:hAnsi="Liberation Sans"/>
-          <w:color w:val="263238"/>
-          <w:sz w:val="20"/>
-        </w:rPr>
-        <w:t>El pueblo descarta a Testigo Cero, mientras la novia reconoce su valor.</w:t>
-      </w:r>
-    </w:p>
-    <w:p>
-      <w:pPr>
-        <w:pStyle w:val="ListBullet"/>
-        <w:spacing w:after="40"/>
-        <w:ind w:left="288" w:hanging="230"/>
-      </w:pPr>
-      <w:r>
-        <w:rPr>
-          <w:rFonts w:ascii="Liberation Sans" w:hAnsi="Liberation Sans"/>
-          <w:color w:val="263238"/>
-          <w:sz w:val="20"/>
-        </w:rPr>
-        <w:t>Protagonista y novia se complementan sin convertirse en versiones idealizadas.</w:t>
+        <w:t>4.12. Testigo Cero</w:t>
+      </w:r>
+    </w:p>
+    <w:p>
+      <w:r>
+        <w:rPr>
+          <w:rFonts w:ascii="Liberation Sans" w:hAnsi="Liberation Sans"/>
+          <w:color w:val="263238"/>
+          <w:sz w:val="21"/>
+        </w:rPr>
+        <w:t>Personaje recurrente aparentemente inútil. Sus declaraciones parecen contradictorias porque utiliza referencias temporales y espaciales ambiguas, pero son verificables. La novia fue una de las pocas personas que aprendió a interpretarlo.</w:t>
+      </w:r>
+    </w:p>
+    <w:p>
+      <w:r>
+        <w:rPr>
+          <w:rFonts w:ascii="Liberation Sans" w:hAnsi="Liberation Sans"/>
+          <w:color w:val="263238"/>
+          <w:sz w:val="21"/>
+        </w:rPr>
+        <w:t>Debe utilizarse con cuidado: sus frases nunca servirán como excusa para una pista arbitraria.</w:t>
       </w:r>
     </w:p>
     <w:p>
@@ -6987,17 +7156,82 @@
           <w:color w:val="9A6138"/>
           <w:sz w:val="28"/>
         </w:rPr>
-        <w:t>4.13. Retratos y expresiones</w:t>
-      </w:r>
-    </w:p>
-    <w:p>
-      <w:r>
-        <w:rPr>
-          <w:rFonts w:ascii="Liberation Sans" w:hAnsi="Liberation Sans"/>
-          <w:color w:val="263238"/>
-          <w:sz w:val="21"/>
-        </w:rPr>
-        <w:t>Se utilizarán retratos pixel art para pareja, Custodio y NPCs principales. Protagonista y novia tendrán entre cuatro y cinco expresiones; NPCs, entre dos y tres; el Custodio utilizará estados geométricos.</w:t>
+        <w:t>4.13. Relaciones</w:t>
+      </w:r>
+    </w:p>
+    <w:p>
+      <w:pPr>
+        <w:pStyle w:val="ListBullet"/>
+        <w:spacing w:after="40"/>
+        <w:ind w:left="288" w:hanging="230"/>
+      </w:pPr>
+      <w:r>
+        <w:rPr>
+          <w:rFonts w:ascii="Liberation Sans" w:hAnsi="Liberation Sans"/>
+          <w:color w:val="263238"/>
+          <w:sz w:val="20"/>
+        </w:rPr>
+        <w:t>Nodo y Prima discuten sobre si todo debe estar conectado.</w:t>
+      </w:r>
+    </w:p>
+    <w:p>
+      <w:pPr>
+        <w:pStyle w:val="ListBullet"/>
+        <w:spacing w:after="40"/>
+        <w:ind w:left="288" w:hanging="230"/>
+      </w:pPr>
+      <w:r>
+        <w:rPr>
+          <w:rFonts w:ascii="Liberation Sans" w:hAnsi="Liberation Sans"/>
+          <w:color w:val="263238"/>
+          <w:sz w:val="20"/>
+        </w:rPr>
+        <w:t>Silogio documenta inventos cuyos nombres Permuto cambia constantemente.</w:t>
+      </w:r>
+    </w:p>
+    <w:p>
+      <w:pPr>
+        <w:pStyle w:val="ListBullet"/>
+        <w:spacing w:after="40"/>
+        <w:ind w:left="288" w:hanging="230"/>
+      </w:pPr>
+      <w:r>
+        <w:rPr>
+          <w:rFonts w:ascii="Liberation Sans" w:hAnsi="Liberation Sans"/>
+          <w:color w:val="263238"/>
+          <w:sz w:val="20"/>
+        </w:rPr>
+        <w:t>Corolaria exige predicciones exactas a Paralaje.</w:t>
+      </w:r>
+    </w:p>
+    <w:p>
+      <w:pPr>
+        <w:pStyle w:val="ListBullet"/>
+        <w:spacing w:after="40"/>
+        <w:ind w:left="288" w:hanging="230"/>
+      </w:pPr>
+      <w:r>
+        <w:rPr>
+          <w:rFonts w:ascii="Liberation Sans" w:hAnsi="Liberation Sans"/>
+          <w:color w:val="263238"/>
+          <w:sz w:val="20"/>
+        </w:rPr>
+        <w:t>El pueblo descarta a Testigo Cero, mientras la novia reconoce su valor.</w:t>
+      </w:r>
+    </w:p>
+    <w:p>
+      <w:pPr>
+        <w:pStyle w:val="ListBullet"/>
+        <w:spacing w:after="40"/>
+        <w:ind w:left="288" w:hanging="230"/>
+      </w:pPr>
+      <w:r>
+        <w:rPr>
+          <w:rFonts w:ascii="Liberation Sans" w:hAnsi="Liberation Sans"/>
+          <w:color w:val="263238"/>
+          <w:sz w:val="20"/>
+        </w:rPr>
+        <w:t>Protagonista y novia se complementan sin convertirse en versiones idealizadas.</w:t>
       </w:r>
     </w:p>
     <w:p>
@@ -7011,7 +7245,31 @@
           <w:color w:val="9A6138"/>
           <w:sz w:val="28"/>
         </w:rPr>
-        <w:t>4.14. Personalización pendiente</w:t>
+        <w:t>4.14. Retratos y expresiones</w:t>
+      </w:r>
+    </w:p>
+    <w:p>
+      <w:r>
+        <w:rPr>
+          <w:rFonts w:ascii="Liberation Sans" w:hAnsi="Liberation Sans"/>
+          <w:color w:val="263238"/>
+          <w:sz w:val="21"/>
+        </w:rPr>
+        <w:t>Se utilizarán retratos pixel art para pareja, Custodio y NPCs principales. Protagonista y novia tendrán entre cuatro y cinco expresiones; NPCs, entre dos y tres; el Custodio utilizará estados geométricos.</w:t>
+      </w:r>
+    </w:p>
+    <w:p>
+      <w:pPr>
+        <w:pStyle w:val="Heading2"/>
+      </w:pPr>
+      <w:r>
+        <w:rPr>
+          <w:rFonts w:ascii="Liberation Sans" w:hAnsi="Liberation Sans"/>
+          <w:b/>
+          <w:color w:val="9A6138"/>
+          <w:sz w:val="28"/>
+        </w:rPr>
+        <w:t>4.15. Personalización pendiente</w:t>
       </w:r>
     </w:p>
     <w:p>
@@ -7828,6 +8086,16 @@
       </w:r>
     </w:p>
     <w:p>
+      <w:r>
+        <w:rPr>
+          <w:rFonts w:ascii="Liberation Sans" w:hAnsi="Liberation Sans"/>
+          <w:color w:val="263238"/>
+          <w:sz w:val="21"/>
+        </w:rPr>
+        <w:t>La Plaza del Axioma funciona como introducción narrativa y núcleo central del pueblo. Durante el prólogo se encuentra en preparación para la boda del día siguiente.</w:t>
+      </w:r>
+    </w:p>
+    <w:p>
       <w:pPr>
         <w:pStyle w:val="ListBullet"/>
         <w:spacing w:after="40"/>
@@ -7836,10 +8104,19 @@
       <w:r>
         <w:rPr>
           <w:rFonts w:ascii="Liberation Sans" w:hAnsi="Liberation Sans"/>
-          <w:color w:val="263238"/>
-          <w:sz w:val="20"/>
-        </w:rPr>
-        <w:t>P1: ceremonia y fuente.</w:t>
+          <w:b/>
+          <w:color w:val="263238"/>
+          <w:sz w:val="20"/>
+        </w:rPr>
+        <w:t>PL1: centro ceremonial.</w:t>
+      </w:r>
+      <w:r>
+        <w:rPr>
+          <w:rFonts w:ascii="Liberation Sans" w:hAnsi="Liberation Sans"/>
+          <w:color w:val="263238"/>
+          <w:sz w:val="20"/>
+        </w:rPr>
+        <w:t xml:space="preserve"> Altar, fuente y espacio principal de la plaza.</w:t>
       </w:r>
     </w:p>
     <w:p>
@@ -7851,10 +8128,19 @@
       <w:r>
         <w:rPr>
           <w:rFonts w:ascii="Liberation Sans" w:hAnsi="Liberation Sans"/>
-          <w:color w:val="263238"/>
-          <w:sz w:val="20"/>
-        </w:rPr>
-        <w:t>P2: calle de la biblioteca.</w:t>
+          <w:b/>
+          <w:color w:val="263238"/>
+          <w:sz w:val="20"/>
+        </w:rPr>
+        <w:t>PL2: zona de invitados.</w:t>
+      </w:r>
+      <w:r>
+        <w:rPr>
+          <w:rFonts w:ascii="Liberation Sans" w:hAnsi="Liberation Sans"/>
+          <w:color w:val="263238"/>
+          <w:sz w:val="20"/>
+        </w:rPr>
+        <w:t xml:space="preserve"> Filas de sillas, mesas de banquete, flores y cajas pendientes de colocar.</w:t>
       </w:r>
     </w:p>
     <w:p>
@@ -7866,10 +8152,19 @@
       <w:r>
         <w:rPr>
           <w:rFonts w:ascii="Liberation Sans" w:hAnsi="Liberation Sans"/>
-          <w:color w:val="263238"/>
-          <w:sz w:val="20"/>
-        </w:rPr>
-        <w:t>P3: calle de los canales.</w:t>
+          <w:b/>
+          <w:color w:val="263238"/>
+          <w:sz w:val="20"/>
+        </w:rPr>
+        <w:t>PL3: tablón de preparativos.</w:t>
+      </w:r>
+      <w:r>
+        <w:rPr>
+          <w:rFonts w:ascii="Liberation Sans" w:hAnsi="Liberation Sans"/>
+          <w:color w:val="263238"/>
+          <w:sz w:val="20"/>
+        </w:rPr>
+        <w:t xml:space="preserve"> Introduce movimiento, interacción, cuaderno y guardado dentro de la ficción.</w:t>
       </w:r>
     </w:p>
     <w:p>
@@ -7881,10 +8176,19 @@
       <w:r>
         <w:rPr>
           <w:rFonts w:ascii="Liberation Sans" w:hAnsi="Liberation Sans"/>
-          <w:color w:val="263238"/>
-          <w:sz w:val="20"/>
-        </w:rPr>
-        <w:t>P4: camino del jardín.</w:t>
+          <w:b/>
+          <w:color w:val="263238"/>
+          <w:sz w:val="20"/>
+        </w:rPr>
+        <w:t>PL4: zona de organización.</w:t>
+      </w:r>
+      <w:r>
+        <w:rPr>
+          <w:rFonts w:ascii="Liberation Sans" w:hAnsi="Liberation Sans"/>
+          <w:color w:val="263238"/>
+          <w:sz w:val="20"/>
+        </w:rPr>
+        <w:t xml:space="preserve"> Maestro de ceremonias y habitantes que preparan el evento.</w:t>
       </w:r>
     </w:p>
     <w:p>
@@ -7896,10 +8200,19 @@
       <w:r>
         <w:rPr>
           <w:rFonts w:ascii="Liberation Sans" w:hAnsi="Liberation Sans"/>
-          <w:color w:val="263238"/>
-          <w:sz w:val="20"/>
-        </w:rPr>
-        <w:t>P5: escalinata del observatorio.</w:t>
+          <w:b/>
+          <w:color w:val="263238"/>
+          <w:sz w:val="20"/>
+        </w:rPr>
+        <w:t>PL5: punto de encuentro.</w:t>
+      </w:r>
+      <w:r>
+        <w:rPr>
+          <w:rFonts w:ascii="Liberation Sans" w:hAnsi="Liberation Sans"/>
+          <w:color w:val="263238"/>
+          <w:sz w:val="20"/>
+        </w:rPr>
+        <w:t xml:space="preserve"> El padre de la novia entrega la nota que inicia la búsqueda.</w:t>
       </w:r>
     </w:p>
     <w:p>
@@ -7911,10 +8224,29 @@
       <w:r>
         <w:rPr>
           <w:rFonts w:ascii="Liberation Sans" w:hAnsi="Liberation Sans"/>
-          <w:color w:val="263238"/>
-          <w:sz w:val="20"/>
-        </w:rPr>
-        <w:t>P6: calle del molino.</w:t>
+          <w:b/>
+          <w:color w:val="263238"/>
+          <w:sz w:val="20"/>
+        </w:rPr>
+        <w:t>PL6: accesos.</w:t>
+      </w:r>
+      <w:r>
+        <w:rPr>
+          <w:rFonts w:ascii="Liberation Sans" w:hAnsi="Liberation Sans"/>
+          <w:color w:val="263238"/>
+          <w:sz w:val="20"/>
+        </w:rPr>
+        <w:t xml:space="preserve"> Caminos hacia la biblioteca, el Paseo de los Siete Puentes, el jardín, el observatorio y el molino.</w:t>
+      </w:r>
+    </w:p>
+    <w:p>
+      <w:r>
+        <w:rPr>
+          <w:rFonts w:ascii="Liberation Sans" w:hAnsi="Liberation Sans"/>
+          <w:color w:val="263238"/>
+          <w:sz w:val="21"/>
+        </w:rPr>
+        <w:t>Durante el vertical slice solo estarán operativos el centro de la plaza y la salida hacia el Paseo de los Siete Puentes. Los demás accesos podrán verse, pero permanecerán narrativamente bloqueados.</w:t>
       </w:r>
     </w:p>
     <w:p>
@@ -8002,7 +8334,17 @@
           <w:color w:val="9A6138"/>
           <w:sz w:val="28"/>
         </w:rPr>
-        <w:t>5.6. Puentes</w:t>
+        <w:t>5.6. Paseo de los Siete Puentes</w:t>
+      </w:r>
+    </w:p>
+    <w:p>
+      <w:r>
+        <w:rPr>
+          <w:rFonts w:ascii="Liberation Sans" w:hAnsi="Liberation Sans"/>
+          <w:color w:val="263238"/>
+          <w:sz w:val="21"/>
+        </w:rPr>
+        <w:t>Esta zona constituye la primera localización de investigación y contiene P2, «El paseo imposible».</w:t>
       </w:r>
     </w:p>
     <w:p>
@@ -8014,10 +8356,19 @@
       <w:r>
         <w:rPr>
           <w:rFonts w:ascii="Liberation Sans" w:hAnsi="Liberation Sans"/>
-          <w:color w:val="263238"/>
-          <w:sz w:val="20"/>
-        </w:rPr>
-        <w:t>U1: entrada de canales.</w:t>
+          <w:b/>
+          <w:color w:val="263238"/>
+          <w:sz w:val="20"/>
+        </w:rPr>
+        <w:t>U1: acceso desde la plaza.</w:t>
+      </w:r>
+      <w:r>
+        <w:rPr>
+          <w:rFonts w:ascii="Liberation Sans" w:hAnsi="Liberation Sans"/>
+          <w:color w:val="263238"/>
+          <w:sz w:val="20"/>
+        </w:rPr>
+        <w:t xml:space="preserve"> Presentación de la localización y orientación básica.</w:t>
       </w:r>
     </w:p>
     <w:p>
@@ -8029,10 +8380,19 @@
       <w:r>
         <w:rPr>
           <w:rFonts w:ascii="Liberation Sans" w:hAnsi="Liberation Sans"/>
-          <w:color w:val="263238"/>
-          <w:sz w:val="20"/>
-        </w:rPr>
-        <w:t>U2: isla de Maestro Nodo.</w:t>
+          <w:b/>
+          <w:color w:val="263238"/>
+          <w:sz w:val="20"/>
+        </w:rPr>
+        <w:t>U2: mirador del mapa.</w:t>
+      </w:r>
+      <w:r>
+        <w:rPr>
+          <w:rFonts w:ascii="Liberation Sans" w:hAnsi="Liberation Sans"/>
+          <w:color w:val="263238"/>
+          <w:sz w:val="20"/>
+        </w:rPr>
+        <w:t xml:space="preserve"> Panel o maqueta manipulada por la novia desde la que se abre P2.</w:t>
       </w:r>
     </w:p>
     <w:p>
@@ -8044,10 +8404,19 @@
       <w:r>
         <w:rPr>
           <w:rFonts w:ascii="Liberation Sans" w:hAnsi="Liberation Sans"/>
-          <w:color w:val="263238"/>
-          <w:sz w:val="20"/>
-        </w:rPr>
-        <w:t>U3: tres pasarelas y compuertas.</w:t>
+          <w:b/>
+          <w:color w:val="263238"/>
+          <w:sz w:val="20"/>
+        </w:rPr>
+        <w:t>U3: islas y pasarelas.</w:t>
+      </w:r>
+      <w:r>
+        <w:rPr>
+          <w:rFonts w:ascii="Liberation Sans" w:hAnsi="Liberation Sans"/>
+          <w:color w:val="263238"/>
+          <w:sz w:val="20"/>
+        </w:rPr>
+        <w:t xml:space="preserve"> Representación ambiental de los lugares y conexiones del problema.</w:t>
       </w:r>
     </w:p>
     <w:p>
@@ -8059,11 +8428,20 @@
       <w:r>
         <w:rPr>
           <w:rFonts w:ascii="Liberation Sans" w:hAnsi="Liberation Sans"/>
+          <w:b/>
           <w:color w:val="263238"/>
           <w:sz w:val="20"/>
         </w:rPr>
         <w:t>U4: embarcadero.</w:t>
       </w:r>
+      <w:r>
+        <w:rPr>
+          <w:rFonts w:ascii="Liberation Sans" w:hAnsi="Liberation Sans"/>
+          <w:color w:val="263238"/>
+          <w:sz w:val="20"/>
+        </w:rPr>
+        <w:t xml:space="preserve"> Contiene la evidencia que aparece o puede interpretarse después de resolver P2.</w:t>
+      </w:r>
     </w:p>
     <w:p>
       <w:pPr>
@@ -8074,10 +8452,29 @@
       <w:r>
         <w:rPr>
           <w:rFonts w:ascii="Liberation Sans" w:hAnsi="Liberation Sans"/>
-          <w:color w:val="263238"/>
-          <w:sz w:val="20"/>
-        </w:rPr>
-        <w:t>U5: conexión al molino.</w:t>
+          <w:b/>
+          <w:color w:val="263238"/>
+          <w:sz w:val="20"/>
+        </w:rPr>
+        <w:t>U5: conexión futura al molino.</w:t>
+      </w:r>
+      <w:r>
+        <w:rPr>
+          <w:rFonts w:ascii="Liberation Sans" w:hAnsi="Liberation Sans"/>
+          <w:color w:val="263238"/>
+          <w:sz w:val="20"/>
+        </w:rPr>
+        <w:t xml:space="preserve"> Permanece cerrada durante el prólogo.</w:t>
+      </w:r>
+    </w:p>
+    <w:p>
+      <w:r>
+        <w:rPr>
+          <w:rFonts w:ascii="Liberation Sans" w:hAnsi="Liberation Sans"/>
+          <w:color w:val="263238"/>
+          <w:sz w:val="21"/>
+        </w:rPr>
+        <w:t>Al resolver P2, el jugador obtiene una anotación de la novia y un símbolo que señala la Biblioteca del Axioma como siguiente destino.</w:t>
       </w:r>
     </w:p>
     <w:p>
@@ -8471,7 +8868,7 @@
           <w:color w:val="263238"/>
           <w:sz w:val="21"/>
         </w:rPr>
-        <w:t>Plaza, calles y sala principal de la biblioteca. Se aprende a investigar y se obtiene el cuaderno.</w:t>
+        <w:t>Plaza del Axioma y Paseo de los Siete Puentes. Se presentan los preparativos de la boda, los controles y el cuaderno. El padre de la novia entrega la primera nota y el jugador resuelve P2. La pista obtenida señala la biblioteca como siguiente destino.</w:t>
       </w:r>
     </w:p>
     <w:p>
@@ -8495,7 +8892,7 @@
           <w:color w:val="263238"/>
           <w:sz w:val="21"/>
         </w:rPr>
-        <w:t>Puentes y Jardín disponibles parcialmente y resolubles en cualquier orden.</w:t>
+        <w:t>La Biblioteca del Axioma queda disponible y comienza la reconstrucción del recorrido de la novia. El Jardín se abre parcialmente y puede investigarse junto con las nuevas pistas de la biblioteca.</w:t>
       </w:r>
     </w:p>
     <w:p>

</xml_diff>